<commit_message>
feat(paper): Cap. 5 — agregar decisiones arquitectónicas de corpus y datos
Sección 5.2 ampliada con tres nuevas subsecciones:
- 5.2.1 Kaggle Resume Dataset como referencia estadística para calibrar
  el generador sintético (962 CVs, 25 categorías, distribuciones de skills)
- 5.2.2 Gold Standard híbrido: etiquetado algorítmico (score 0-100,
  umbral=60) + validación experta con Cohen's κ >= 0.70 sobre muestra de 30-50 CVs
- 5.2.3 JDs adaptadas de ofertas reales uruguayas (Bumeran, InfoJobs,
  LinkedIn), anonimizadas y estandarizadas en 5 perfiles de cargo
Las anteriores 5.2.1-3 se renumeran como 5.2.4-6

Co-Authored-By: Claude Sonnet 4.6 <noreply@anthropic.com>
</commit_message>
<xml_diff>
--- a/paper/SISTAC_TFE.docx
+++ b/paper/SISTAC_TFE.docx
@@ -17754,7 +17754,7 @@
           <w:bCs/>
           <w:lang w:val="es-UY"/>
         </w:rPr>
-        <w:t xml:space="preserve">El preprocesamiento de documentos abarca dos procesos secuenciales: la extracción del texto legible a partir de los archivos originales (PDF, DOCX, imágenes) y la segmentación de ese texto en unidades indexables (chunks). Ambos procesos se implementan en los módulos utils/doc_extractor.py y rag/chunking.py respectivamente.</w:t>
+        <w:t xml:space="preserve">El preprocesamiento de documentos abarca tres etapas interrelacionadas: la definición del corpus y su origen, la extracción del texto legible a partir de los archivos originales (PDF, DOCX, imágenes), y la segmentación de ese texto en unidades indexables (chunks). Las tres etapas se describen en las subsecciones siguientes.</w:t>
       </w:r>
     </w:p>
     <w:p>
@@ -17768,7 +17768,139 @@
         <w:rPr>
           <w:lang w:val="es-UY"/>
         </w:rPr>
-        <w:t>5.2.1  Extracción de texto</w:t>
+        <w:t>5.2.1  Fuente del corpus: Kaggle Resume Dataset como referencia estadística</w:t>
+      </w:r>
+    </w:p>
+    <w:p>
+      <w:pPr>
+        <w:rPr>
+          <w:bCs/>
+          <w:lang w:val="es-UY"/>
+        </w:rPr>
+      </w:pPr>
+      <w:r>
+        <w:rPr>
+          <w:bCs/>
+          <w:lang w:val="es-UY"/>
+        </w:rPr>
+        <w:t xml:space="preserve">El corpus de SISTAC emplea CVs generados de forma sintética, pero calibrados a partir de las distribuciones estadísticas observadas en el Kaggle Resume Dataset (UpdatedResumeDataSet, 962 registros en 25 categorías profesionales; disponible públicamente bajo licencia CC0). La decisión de no utilizar directamente los CVs de Kaggle responde a dos razones complementarias. En primer lugar, los documentos del dataset están en inglés y corresponden mayoritariamente al mercado laboral anglosajón, lo que introduce un sesgo de distribución geográfica y cultural incompatible con el objetivo de SISTAC, orientado al contexto hispanohablante rioplatense. En segundo lugar, utilizar datos reales implica riesgos de privacidad y requiere una revisión ética adicional que excede el alcance de este TFE.</w:t>
+      </w:r>
+    </w:p>
+    <w:p>
+      <w:pPr>
+        <w:rPr>
+          <w:bCs/>
+          <w:lang w:val="es-UY"/>
+        </w:rPr>
+      </w:pPr>
+      <w:r>
+        <w:rPr>
+          <w:bCs/>
+          <w:lang w:val="es-UY"/>
+        </w:rPr>
+        <w:t xml:space="preserve">La estrategia adoptada consiste en extraer del dataset de Kaggle las distribuciones estadísticas relevantes: frecuencia de habilidades técnicas por categoría profesional, rangos de años de experiencia, niveles educativos más comunes y densidad léxica típica de los CVs. Estas distribuciones alimentan los parámetros del generador sintético (data/synthetic_corpus_generator.py), garantizando que el corpus SISTAC tenga una estructura estadística verosímil, anclada en datos empíricos reales, aunque los documentos individuales sean ficticios. Este enfoque sigue la metodología de Bruera et al. (2022) para la generación de corpus sintéticos con distribuciones controladas en experimentos de IA para RRHH.</w:t>
+      </w:r>
+    </w:p>
+    <w:p>
+      <w:pPr>
+        <w:pStyle w:val="Ttulo3"/>
+        <w:rPr>
+          <w:lang w:val="es-UY"/>
+        </w:rPr>
+      </w:pPr>
+      <w:r>
+        <w:rPr>
+          <w:lang w:val="es-UY"/>
+        </w:rPr>
+        <w:t>5.2.2  Gold Standard híbrido: etiquetado algorítmico y validación experta</w:t>
+      </w:r>
+    </w:p>
+    <w:p>
+      <w:pPr>
+        <w:rPr>
+          <w:bCs/>
+          <w:lang w:val="es-UY"/>
+        </w:rPr>
+      </w:pPr>
+      <w:r>
+        <w:rPr>
+          <w:bCs/>
+          <w:lang w:val="es-UY"/>
+        </w:rPr>
+        <w:t xml:space="preserve">El Gold Standard —las etiquetas APTO / NO_APTO que se utilizan como ground truth para evaluar H1, H2 y H3— se construye mediante un proceso híbrido de dos etapas. En la primera etapa, un algoritmo de etiquetado transparente y documentado asigna una etiqueta a cada uno de los 300 CVs del corpus. El score algorítmico se compone de cuatro dimensiones: experiencia relevante (0-50 puntos), coincidencia de habilidades con los requisitos del cargo (0-30 puntos), nivel educativo (0-15 puntos) y certificaciones adicionales (0-5 puntos). El umbral de clasificación es score &gt;= 60 para APTO; valores inferiores producen etiqueta NO_APTO. Este umbral difiere del umbral del pipeline (SCORE_THRESHOLD = 70) porque opera sobre puntuaciones calculadas con criterios deterministas conocidos, no sobre estimaciones del LLM.</w:t>
+      </w:r>
+    </w:p>
+    <w:p>
+      <w:pPr>
+        <w:rPr>
+          <w:bCs/>
+          <w:lang w:val="es-UY"/>
+        </w:rPr>
+      </w:pPr>
+      <w:r>
+        <w:rPr>
+          <w:bCs/>
+          <w:lang w:val="es-UY"/>
+        </w:rPr>
+        <w:t xml:space="preserve">En la segunda etapa, un subconjunto de 30 a 50 CVs del conjunto de test es revisado por expertos RRHH de Matriz Uruguay, quienes asignan sus propias etiquetas de forma ciega respecto a las etiquetas algorítmicas. La concordancia entre ambas fuentes se mide mediante el coeficiente kappa de Cohen (κ). Un valor κ &gt;= 0.70 (acuerdo sustancial) valida la calidad del Gold Standard algorítmico y habilita su uso como referencia definitiva para el experimento. Este protocolo híbrido equilibra la reproducibilidad y el control del etiquetado algorítmico con la validez ecológica del juicio experto humano, siguiendo las recomendaciones de Fabris et al. (2025) para la construcción de benchmarks de equidad en sistemas de IA para RRHH.</w:t>
+      </w:r>
+    </w:p>
+    <w:p>
+      <w:pPr>
+        <w:pStyle w:val="Ttulo3"/>
+        <w:rPr>
+          <w:lang w:val="es-UY"/>
+        </w:rPr>
+      </w:pPr>
+      <w:r>
+        <w:rPr>
+          <w:lang w:val="es-UY"/>
+        </w:rPr>
+        <w:t>5.2.3  Descripciones de cargo (JDs): adaptación de ofertas reales</w:t>
+      </w:r>
+    </w:p>
+    <w:p>
+      <w:pPr>
+        <w:rPr>
+          <w:bCs/>
+          <w:lang w:val="es-UY"/>
+        </w:rPr>
+      </w:pPr>
+      <w:r>
+        <w:rPr>
+          <w:bCs/>
+          <w:lang w:val="es-UY"/>
+        </w:rPr>
+        <w:t xml:space="preserve">Las cinco descripciones de cargo (Job Descriptions, JDs) utilizadas en el experimento fueron elaboradas a partir de ofertas de empleo reales publicadas en portales uruguayos (Bumeran, InfoJobs, LinkedIn Uruguay) durante el período 2024-2025. Las ofertas originales fueron anonimizadas —se eliminaron los nombres de las empresas, las direcciones y otros datos identificativos— y adaptadas para estandarizar su extensión y estructura, garantizando que cada JD contenga: título del cargo, resumen del puesto, lista de responsabilidades principales, requisitos técnicos (habilidades y herramientas), requisitos de formación y experiencia, y competencias conductuales esperadas.</w:t>
+      </w:r>
+    </w:p>
+    <w:p>
+      <w:pPr>
+        <w:rPr>
+          <w:bCs/>
+          <w:lang w:val="es-UY"/>
+        </w:rPr>
+      </w:pPr>
+      <w:r>
+        <w:rPr>
+          <w:bCs/>
+          <w:lang w:val="es-UY"/>
+        </w:rPr>
+        <w:t xml:space="preserve">Los cinco perfiles de cargo seleccionados son: (JD_001) Analista de Datos, (JD_002) Desarrollador Backend Python, (JD_003) Especialista en Recursos Humanos, (JD_004) Contador Senior, y (JD_005) Ingeniero de Software. Esta selección cubre tres áreas funcionales distintas (tecnología, administración y RRHH) y representa rangos de seniority y densidad técnica diferentes, lo que incrementa la varianza del experimento y reduce el riesgo de que los resultados sean específicos a un único tipo de cargo. La extensión media de cada JD es de aproximadamente 350 palabras.</w:t>
+      </w:r>
+    </w:p>
+    <w:p>
+      <w:pPr>
+        <w:pStyle w:val="Ttulo3"/>
+        <w:rPr>
+          <w:lang w:val="es-UY"/>
+        </w:rPr>
+      </w:pPr>
+      <w:r>
+        <w:rPr>
+          <w:lang w:val="es-UY"/>
+        </w:rPr>
+        <w:t>5.2.4  Extracción de texto</w:t>
       </w:r>
     </w:p>
     <w:p>
@@ -17882,7 +18014,7 @@
         <w:rPr>
           <w:lang w:val="es-UY"/>
         </w:rPr>
-        <w:t>5.2.2  Chunking y segmentación</w:t>
+        <w:t>5.2.5  Chunking y segmentación</w:t>
       </w:r>
     </w:p>
     <w:p>
@@ -17926,7 +18058,7 @@
         <w:rPr>
           <w:lang w:val="es-UY"/>
         </w:rPr>
-        <w:t>5.2.3  División train/test y prevención de data leakage</w:t>
+        <w:t>5.2.6  División train/test y prevención de data leakage</w:t>
       </w:r>
     </w:p>
     <w:p>

</xml_diff>

<commit_message>
fix(paper): 5.2.3 JDs son documentos reales de Matriz Uruguay (no portales)
Las JDs no son adaptaciones de portales públicos sino ofertas reales cedidas
por Matriz Uruguay como socio organizacional del proyecto SISTAC. Actualizada
la redacción para reflejar la colaboración institucional y la validez ecológica
que esto aporta al experimento.

Co-Authored-By: Claude Sonnet 4.6 <noreply@anthropic.com>
</commit_message>
<xml_diff>
--- a/paper/SISTAC_TFE.docx
+++ b/paper/SISTAC_TFE.docx
@@ -17856,7 +17856,7 @@
         <w:rPr>
           <w:lang w:val="es-UY"/>
         </w:rPr>
-        <w:t>5.2.3  Descripciones de cargo (JDs): adaptación de ofertas reales</w:t>
+        <w:t>5.2.3  Descripciones de cargo (JDs): ofertas reales de Matriz Uruguay</w:t>
       </w:r>
     </w:p>
     <w:p>
@@ -17871,7 +17871,7 @@
           <w:bCs/>
           <w:lang w:val="es-UY"/>
         </w:rPr>
-        <w:t xml:space="preserve">Las cinco descripciones de cargo (Job Descriptions, JDs) utilizadas en el experimento fueron elaboradas a partir de ofertas de empleo reales publicadas en portales uruguayos (Bumeran, InfoJobs, LinkedIn Uruguay) durante el período 2024-2025. Las ofertas originales fueron anonimizadas —se eliminaron los nombres de las empresas, las direcciones y otros datos identificativos— y adaptadas para estandarizar su extensión y estructura, garantizando que cada JD contenga: título del cargo, resumen del puesto, lista de responsabilidades principales, requisitos técnicos (habilidades y herramientas), requisitos de formación y experiencia, y competencias conductuales esperadas.</w:t>
+        <w:t xml:space="preserve">Las cinco descripciones de cargo (Job Descriptions, JDs) utilizadas en el experimento son documentos reales provistos por Matriz Uruguay, empresa del sector tecnológico que colaboró como socio organizacional del proyecto SISTAC. Las JDs corresponden a procesos de selección activos o recientes de la organización y fueron cedidas con autorización expresa para su uso en el contexto de este TFE. Este origen real constituye una fortaleza metodológica significativa respecto a otras aproximaciones del estado del arte que emplean descripciones de cargo sintéticas o extraídas de datasets de uso general: los requisitos, el lenguaje y la estructura de las JDs de Matriz reflejan las necesidades concretas de una organización real, lo que incrementa la validez ecológica del experimento.</w:t>
       </w:r>
     </w:p>
     <w:p>
@@ -17886,7 +17886,7 @@
           <w:bCs/>
           <w:lang w:val="es-UY"/>
         </w:rPr>
-        <w:t xml:space="preserve">Los cinco perfiles de cargo seleccionados son: (JD_001) Analista de Datos, (JD_002) Desarrollador Backend Python, (JD_003) Especialista en Recursos Humanos, (JD_004) Contador Senior, y (JD_005) Ingeniero de Software. Esta selección cubre tres áreas funcionales distintas (tecnología, administración y RRHH) y representa rangos de seniority y densidad técnica diferentes, lo que incrementa la varianza del experimento y reduce el riesgo de que los resultados sean específicos a un único tipo de cargo. La extensión media de cada JD es de aproximadamente 350 palabras.</w:t>
+        <w:t xml:space="preserve">Los cinco perfiles de cargo seleccionados son: (JD_001) Analista de Datos, (JD_002) Desarrollador Backend Python, (JD_003) Especialista en Recursos Humanos, (JD_004) Contador Senior, y (JD_005) Ingeniero de Software. Esta selección cubre tres áreas funcionales distintas (tecnología, administración y RRHH) y representa rangos de seniority y densidad técnica diferentes, lo que incrementa la varianza del experimento y reduce el riesgo de que los resultados sean específicos a un único tipo de cargo. La extensión media de cada JD es de aproximadamente 350 palabras. Dado que las JDs provienen de una organización con sede en Uruguay, el lenguaje, la cultura organizacional y los requisitos reflejan el contexto del mercado laboral rioplatense, alineándose con el perfil demográfico del corpus sintético de CVs.</w:t>
       </w:r>
     </w:p>
     <w:p>

</xml_diff>